<commit_message>
Intégration keycloak + Stripe API
</commit_message>
<xml_diff>
--- a/ShopConnect_AnalyseConceptuelle.docx
+++ b/ShopConnect_AnalyseConceptuelle.docx
@@ -6,13 +6,8 @@
       <w:pPr>
         <w:pStyle w:val="Nomdelasocit"/>
       </w:pPr>
-      <w:proofErr w:type="spellStart"/>
       <w:r>
-        <w:t>ShopConnect</w:t>
-      </w:r>
-      <w:proofErr w:type="spellEnd"/>
-      <w:r>
-        <w:t xml:space="preserve"> </w:t>
+        <w:t xml:space="preserve">ShopConnect </w:t>
       </w:r>
       <w:r>
         <w:t>–</w:t>
@@ -62,7 +57,7 @@
                     <pic:cNvPicPr/>
                   </pic:nvPicPr>
                   <pic:blipFill>
-                    <a:blip r:embed="rId10"/>
+                    <a:blip r:embed="rId11"/>
                     <a:stretch>
                       <a:fillRect/>
                     </a:stretch>
@@ -116,7 +111,7 @@
                     <pic:cNvPicPr/>
                   </pic:nvPicPr>
                   <pic:blipFill>
-                    <a:blip r:embed="rId11"/>
+                    <a:blip r:embed="rId12"/>
                     <a:stretch>
                       <a:fillRect/>
                     </a:stretch>
@@ -192,7 +187,7 @@
                     <pic:cNvPicPr/>
                   </pic:nvPicPr>
                   <pic:blipFill>
-                    <a:blip r:embed="rId12"/>
+                    <a:blip r:embed="rId13"/>
                     <a:stretch>
                       <a:fillRect/>
                     </a:stretch>
@@ -363,19 +358,11 @@
           <w:lang w:val="fr-BE"/>
         </w:rPr>
       </w:pPr>
-      <w:proofErr w:type="spellStart"/>
       <w:r>
         <w:rPr>
           <w:lang w:val="fr-BE"/>
         </w:rPr>
-        <w:t>password</w:t>
-      </w:r>
-      <w:proofErr w:type="spellEnd"/>
-      <w:r>
-        <w:rPr>
-          <w:lang w:val="fr-BE"/>
-        </w:rPr>
-        <w:t>: Mot de passe sécurisé de l'utilisateur.</w:t>
+        <w:t>password: Mot de passe sécurisé de l'utilisateur.</w:t>
       </w:r>
     </w:p>
     <w:p>
@@ -399,19 +386,11 @@
           <w:lang w:val="fr-BE"/>
         </w:rPr>
       </w:pPr>
-      <w:proofErr w:type="spellStart"/>
       <w:r>
         <w:rPr>
           <w:lang w:val="fr-BE"/>
         </w:rPr>
-        <w:t>role</w:t>
-      </w:r>
-      <w:proofErr w:type="spellEnd"/>
-      <w:r>
-        <w:rPr>
-          <w:lang w:val="fr-BE"/>
-        </w:rPr>
-        <w:t>: Rôle de l'utilisateur (Admin, M</w:t>
+        <w:t>role: Rôle de l'utilisateur (Admin, M</w:t>
       </w:r>
       <w:r>
         <w:rPr>
@@ -483,47 +462,11 @@
           <w:lang w:val="fr-BE"/>
         </w:rPr>
       </w:pPr>
-      <w:proofErr w:type="spellStart"/>
       <w:r>
         <w:rPr>
           <w:lang w:val="fr-BE"/>
         </w:rPr>
-        <w:t>auth_provider</w:t>
-      </w:r>
-      <w:proofErr w:type="spellEnd"/>
-      <w:r>
-        <w:rPr>
-          <w:lang w:val="fr-BE"/>
-        </w:rPr>
-        <w:t>: Méthode d'authentification (</w:t>
-      </w:r>
-      <w:proofErr w:type="gramStart"/>
-      <w:r>
-        <w:rPr>
-          <w:lang w:val="fr-BE"/>
-        </w:rPr>
-        <w:t>email</w:t>
-      </w:r>
-      <w:proofErr w:type="gramEnd"/>
-      <w:r>
-        <w:rPr>
-          <w:lang w:val="fr-BE"/>
-        </w:rPr>
-        <w:t xml:space="preserve">, </w:t>
-      </w:r>
-      <w:proofErr w:type="spellStart"/>
-      <w:r>
-        <w:rPr>
-          <w:lang w:val="fr-BE"/>
-        </w:rPr>
-        <w:t>facebook</w:t>
-      </w:r>
-      <w:proofErr w:type="spellEnd"/>
-      <w:r>
-        <w:rPr>
-          <w:lang w:val="fr-BE"/>
-        </w:rPr>
-        <w:t>, google).</w:t>
+        <w:t>auth_provider: Méthode d'authentification (email, facebook, google).</w:t>
       </w:r>
     </w:p>
     <w:p>
@@ -533,19 +476,11 @@
           <w:lang w:val="fr-BE"/>
         </w:rPr>
       </w:pPr>
-      <w:proofErr w:type="spellStart"/>
       <w:r>
         <w:rPr>
           <w:lang w:val="fr-BE"/>
         </w:rPr>
-        <w:t>date_inscription</w:t>
-      </w:r>
-      <w:proofErr w:type="spellEnd"/>
-      <w:r>
-        <w:rPr>
-          <w:lang w:val="fr-BE"/>
-        </w:rPr>
-        <w:t>: Date d'inscription de l'utilisateur sur la plateforme.</w:t>
+        <w:t>date_inscription: Date d'inscription de l'utilisateur sur la plateforme.</w:t>
       </w:r>
     </w:p>
     <w:p>
@@ -583,21 +518,7 @@
         <w:rPr>
           <w:lang w:val="fr-BE"/>
         </w:rPr>
-        <w:t xml:space="preserve">1,n avec Panier via </w:t>
-      </w:r>
-      <w:proofErr w:type="spellStart"/>
-      <w:r>
-        <w:rPr>
-          <w:lang w:val="fr-BE"/>
-        </w:rPr>
-        <w:t>r_Panier_Utilisateur</w:t>
-      </w:r>
-      <w:proofErr w:type="spellEnd"/>
-      <w:r>
-        <w:rPr>
-          <w:lang w:val="fr-BE"/>
-        </w:rPr>
-        <w:t>: Un utilisateur peut avoir plusieurs paniers, mais un panier appartient à un seul utilisateur.</w:t>
+        <w:t>1,n avec Panier via r_Panier_Utilisateur: Un utilisateur peut avoir plusieurs paniers, mais un panier appartient à un seul utilisateur.</w:t>
       </w:r>
     </w:p>
     <w:p>
@@ -625,35 +546,7 @@
         <w:rPr>
           <w:lang w:val="fr-BE"/>
         </w:rPr>
-        <w:t xml:space="preserve">1,n avec Promotion via </w:t>
-      </w:r>
-      <w:proofErr w:type="spellStart"/>
-      <w:r>
-        <w:rPr>
-          <w:lang w:val="fr-BE"/>
-        </w:rPr>
-        <w:t>r_Utilisateur_Promotion</w:t>
-      </w:r>
-      <w:proofErr w:type="spellEnd"/>
-      <w:r>
-        <w:rPr>
-          <w:lang w:val="fr-BE"/>
-        </w:rPr>
-        <w:t xml:space="preserve">: Un utilisateur de type </w:t>
-      </w:r>
-      <w:proofErr w:type="spellStart"/>
-      <w:r>
-        <w:rPr>
-          <w:lang w:val="fr-BE"/>
-        </w:rPr>
-        <w:t>MarketingManager</w:t>
-      </w:r>
-      <w:proofErr w:type="spellEnd"/>
-      <w:r>
-        <w:rPr>
-          <w:lang w:val="fr-BE"/>
-        </w:rPr>
-        <w:t xml:space="preserve"> peut créer plusieurs promotions.</w:t>
+        <w:t>1,n avec Promotion via r_Utilisateur_Promotion: Un utilisateur de type MarketingManager peut créer plusieurs promotions.</w:t>
       </w:r>
     </w:p>
     <w:p>
@@ -667,21 +560,7 @@
         <w:rPr>
           <w:lang w:val="fr-BE"/>
         </w:rPr>
-        <w:t xml:space="preserve">1,n avec Commande via </w:t>
-      </w:r>
-      <w:proofErr w:type="spellStart"/>
-      <w:r>
-        <w:rPr>
-          <w:lang w:val="fr-BE"/>
-        </w:rPr>
-        <w:t>r_Commande_Utilisateur</w:t>
-      </w:r>
-      <w:proofErr w:type="spellEnd"/>
-      <w:r>
-        <w:rPr>
-          <w:lang w:val="fr-BE"/>
-        </w:rPr>
-        <w:t>: Un utilisateur peut passer plusieurs commandes.</w:t>
+        <w:t>1,n avec Commande via r_Commande_Utilisateur: Un utilisateur peut passer plusieurs commandes.</w:t>
       </w:r>
     </w:p>
     <w:p>
@@ -695,21 +574,7 @@
         <w:rPr>
           <w:lang w:val="fr-BE"/>
         </w:rPr>
-        <w:t xml:space="preserve">1,n avec Avis via </w:t>
-      </w:r>
-      <w:proofErr w:type="spellStart"/>
-      <w:r>
-        <w:rPr>
-          <w:lang w:val="fr-BE"/>
-        </w:rPr>
-        <w:t>r_Avis_Utilisateur</w:t>
-      </w:r>
-      <w:proofErr w:type="spellEnd"/>
-      <w:r>
-        <w:rPr>
-          <w:lang w:val="fr-BE"/>
-        </w:rPr>
-        <w:t>: Un utilisateur peut écrire plusieurs avis sur des produits.</w:t>
+        <w:t>1,n avec Avis via r_Avis_Utilisateur: Un utilisateur peut écrire plusieurs avis sur des produits.</w:t>
       </w:r>
     </w:p>
     <w:p>
@@ -820,19 +685,11 @@
           <w:lang w:val="fr-BE"/>
         </w:rPr>
       </w:pPr>
-      <w:proofErr w:type="spellStart"/>
       <w:r>
         <w:rPr>
           <w:lang w:val="fr-BE"/>
         </w:rPr>
-        <w:t>date_creation</w:t>
-      </w:r>
-      <w:proofErr w:type="spellEnd"/>
-      <w:r>
-        <w:rPr>
-          <w:lang w:val="fr-BE"/>
-        </w:rPr>
-        <w:t>: Date de création du panier.</w:t>
+        <w:t>date_creation: Date de création du panier.</w:t>
       </w:r>
     </w:p>
     <w:p>
@@ -869,21 +726,7 @@
         <w:rPr>
           <w:lang w:val="fr-BE"/>
         </w:rPr>
-        <w:t xml:space="preserve">n,1 avec Utilisateur via </w:t>
-      </w:r>
-      <w:proofErr w:type="spellStart"/>
-      <w:r>
-        <w:rPr>
-          <w:lang w:val="fr-BE"/>
-        </w:rPr>
-        <w:t>r_Panier_Utilisateur</w:t>
-      </w:r>
-      <w:proofErr w:type="spellEnd"/>
-      <w:r>
-        <w:rPr>
-          <w:lang w:val="fr-BE"/>
-        </w:rPr>
-        <w:t>: Chaque panier est associé à un seul utilisateur.</w:t>
+        <w:t>n,1 avec Utilisateur via r_Panier_Utilisateur: Chaque panier est associé à un seul utilisateur.</w:t>
       </w:r>
     </w:p>
     <w:p>
@@ -893,33 +736,11 @@
           <w:lang w:val="fr-BE"/>
         </w:rPr>
       </w:pPr>
-      <w:proofErr w:type="spellStart"/>
       <w:r>
         <w:rPr>
           <w:lang w:val="fr-BE"/>
         </w:rPr>
-        <w:t>n,n</w:t>
-      </w:r>
-      <w:proofErr w:type="spellEnd"/>
-      <w:r>
-        <w:rPr>
-          <w:lang w:val="fr-BE"/>
-        </w:rPr>
-        <w:t xml:space="preserve"> avec Produit via </w:t>
-      </w:r>
-      <w:proofErr w:type="spellStart"/>
-      <w:r>
-        <w:rPr>
-          <w:lang w:val="fr-BE"/>
-        </w:rPr>
-        <w:t>Panier_Produit</w:t>
-      </w:r>
-      <w:proofErr w:type="spellEnd"/>
-      <w:r>
-        <w:rPr>
-          <w:lang w:val="fr-BE"/>
-        </w:rPr>
-        <w:t>: Un panier peut contenir plusieurs produits, et un produit peut apparaître dans plusieurs paniers.</w:t>
+        <w:t>n,n avec Produit via Panier_Produit: Un panier peut contenir plusieurs produits, et un produit peut apparaître dans plusieurs paniers.</w:t>
       </w:r>
     </w:p>
     <w:p>
@@ -1068,19 +889,11 @@
           <w:lang w:val="fr-BE"/>
         </w:rPr>
       </w:pPr>
-      <w:proofErr w:type="spellStart"/>
       <w:r>
         <w:rPr>
           <w:lang w:val="fr-BE"/>
         </w:rPr>
-        <w:t>quantite_stock</w:t>
-      </w:r>
-      <w:proofErr w:type="spellEnd"/>
-      <w:r>
-        <w:rPr>
-          <w:lang w:val="fr-BE"/>
-        </w:rPr>
-        <w:t>: Quantité de produit disponible en stock.</w:t>
+        <w:t>quantite_stock: Quantité de produit disponible en stock.</w:t>
       </w:r>
     </w:p>
     <w:p>
@@ -1090,19 +903,11 @@
           <w:lang w:val="fr-BE"/>
         </w:rPr>
       </w:pPr>
-      <w:proofErr w:type="spellStart"/>
       <w:r>
         <w:rPr>
           <w:lang w:val="fr-BE"/>
         </w:rPr>
-        <w:t>image_url</w:t>
-      </w:r>
-      <w:proofErr w:type="spellEnd"/>
-      <w:r>
-        <w:rPr>
-          <w:lang w:val="fr-BE"/>
-        </w:rPr>
-        <w:t>: URL de l'image du produit.</w:t>
+        <w:t>image_url: URL de l'image du produit.</w:t>
       </w:r>
     </w:p>
     <w:p>
@@ -1112,19 +917,11 @@
           <w:lang w:val="fr-BE"/>
         </w:rPr>
       </w:pPr>
-      <w:proofErr w:type="spellStart"/>
       <w:r>
         <w:rPr>
           <w:lang w:val="fr-BE"/>
         </w:rPr>
-        <w:t>url_slug</w:t>
-      </w:r>
-      <w:proofErr w:type="spellEnd"/>
-      <w:r>
-        <w:rPr>
-          <w:lang w:val="fr-BE"/>
-        </w:rPr>
-        <w:t>: Identifiant textuel unique utilisé pour générer des URL explicites.</w:t>
+        <w:t>url_slug: Identifiant textuel unique utilisé pour générer des URL explicites.</w:t>
       </w:r>
     </w:p>
     <w:p>
@@ -1160,21 +957,7 @@
         <w:rPr>
           <w:lang w:val="fr-BE"/>
         </w:rPr>
-        <w:t xml:space="preserve">1,n avec </w:t>
-      </w:r>
-      <w:proofErr w:type="spellStart"/>
-      <w:r>
-        <w:rPr>
-          <w:lang w:val="fr-BE"/>
-        </w:rPr>
-        <w:t>Categorie</w:t>
-      </w:r>
-      <w:proofErr w:type="spellEnd"/>
-      <w:r>
-        <w:rPr>
-          <w:lang w:val="fr-BE"/>
-        </w:rPr>
-        <w:t>: Un produit appartient à une seule catégorie, mais une catégorie peut avoir plusieurs produits.</w:t>
+        <w:t>1,n avec Categorie: Un produit appartient à une seule catégorie, mais une catégorie peut avoir plusieurs produits.</w:t>
       </w:r>
     </w:p>
     <w:p>
@@ -1189,21 +972,7 @@
           <w:lang w:val="fr-BE"/>
         </w:rPr>
         <w:lastRenderedPageBreak/>
-        <w:t xml:space="preserve">1,n avec Boutique via </w:t>
-      </w:r>
-      <w:proofErr w:type="spellStart"/>
-      <w:r>
-        <w:rPr>
-          <w:lang w:val="fr-BE"/>
-        </w:rPr>
-        <w:t>r_Boutique_Produit</w:t>
-      </w:r>
-      <w:proofErr w:type="spellEnd"/>
-      <w:r>
-        <w:rPr>
-          <w:lang w:val="fr-BE"/>
-        </w:rPr>
-        <w:t>: Un produit est vendu par une seule boutique, mais une boutique peut vendre plusieurs produits.</w:t>
+        <w:t>1,n avec Boutique via r_Boutique_Produit: Un produit est vendu par une seule boutique, mais une boutique peut vendre plusieurs produits.</w:t>
       </w:r>
     </w:p>
     <w:p>
@@ -1217,21 +986,7 @@
         <w:rPr>
           <w:lang w:val="fr-BE"/>
         </w:rPr>
-        <w:t xml:space="preserve">1,n avec Commande via </w:t>
-      </w:r>
-      <w:proofErr w:type="spellStart"/>
-      <w:r>
-        <w:rPr>
-          <w:lang w:val="fr-BE"/>
-        </w:rPr>
-        <w:t>r_Commande_Produit</w:t>
-      </w:r>
-      <w:proofErr w:type="spellEnd"/>
-      <w:r>
-        <w:rPr>
-          <w:lang w:val="fr-BE"/>
-        </w:rPr>
-        <w:t>: Un produit peut être commandé dans plusieurs commandes, mais une commande peut inclure plusieurs produits.</w:t>
+        <w:t>1,n avec Commande via r_Commande_Produit: Un produit peut être commandé dans plusieurs commandes, mais une commande peut inclure plusieurs produits.</w:t>
       </w:r>
     </w:p>
     <w:p>
@@ -1245,21 +1000,7 @@
         <w:rPr>
           <w:lang w:val="fr-BE"/>
         </w:rPr>
-        <w:t xml:space="preserve">1,n avec Avis via </w:t>
-      </w:r>
-      <w:proofErr w:type="spellStart"/>
-      <w:r>
-        <w:rPr>
-          <w:lang w:val="fr-BE"/>
-        </w:rPr>
-        <w:t>r_Avis_Produit</w:t>
-      </w:r>
-      <w:proofErr w:type="spellEnd"/>
-      <w:r>
-        <w:rPr>
-          <w:lang w:val="fr-BE"/>
-        </w:rPr>
-        <w:t>: Un produit peut recevoir plusieurs avis.</w:t>
+        <w:t>1,n avec Avis via r_Avis_Produit: Un produit peut recevoir plusieurs avis.</w:t>
       </w:r>
     </w:p>
     <w:p>
@@ -1273,21 +1014,7 @@
         <w:rPr>
           <w:lang w:val="fr-BE"/>
         </w:rPr>
-        <w:t xml:space="preserve">1,n avec Promotion via </w:t>
-      </w:r>
-      <w:proofErr w:type="spellStart"/>
-      <w:r>
-        <w:rPr>
-          <w:lang w:val="fr-BE"/>
-        </w:rPr>
-        <w:t>r_Promotion_Produit</w:t>
-      </w:r>
-      <w:proofErr w:type="spellEnd"/>
-      <w:r>
-        <w:rPr>
-          <w:lang w:val="fr-BE"/>
-        </w:rPr>
-        <w:t>: Un produit peut avoir plusieurs promotions.</w:t>
+        <w:t>1,n avec Promotion via r_Promotion_Produit: Un produit peut avoir plusieurs promotions.</w:t>
       </w:r>
     </w:p>
     <w:p>
@@ -1313,16 +1040,8 @@
         <w:rPr>
           <w:lang w:val="fr-BE"/>
         </w:rPr>
-        <w:t xml:space="preserve">Table : </w:t>
+        <w:t>Table : Categorie</w:t>
       </w:r>
-      <w:proofErr w:type="spellStart"/>
-      <w:r>
-        <w:rPr>
-          <w:lang w:val="fr-BE"/>
-        </w:rPr>
-        <w:t>Categorie</w:t>
-      </w:r>
-      <w:proofErr w:type="spellEnd"/>
     </w:p>
     <w:p>
       <w:pPr>
@@ -1605,19 +1324,11 @@
           <w:lang w:val="fr-BE"/>
         </w:rPr>
       </w:pPr>
-      <w:proofErr w:type="spellStart"/>
       <w:r>
         <w:rPr>
           <w:lang w:val="fr-BE"/>
         </w:rPr>
-        <w:t>url_slug</w:t>
-      </w:r>
-      <w:proofErr w:type="spellEnd"/>
-      <w:r>
-        <w:rPr>
-          <w:lang w:val="fr-BE"/>
-        </w:rPr>
-        <w:t>: Identifiant textuel unique pour générer des URL explicites.</w:t>
+        <w:t>url_slug: Identifiant textuel unique pour générer des URL explicites.</w:t>
       </w:r>
     </w:p>
     <w:p>
@@ -1627,19 +1338,11 @@
           <w:lang w:val="fr-BE"/>
         </w:rPr>
       </w:pPr>
-      <w:proofErr w:type="spellStart"/>
       <w:r>
         <w:rPr>
           <w:lang w:val="fr-BE"/>
         </w:rPr>
-        <w:t>telephone</w:t>
-      </w:r>
-      <w:proofErr w:type="spellEnd"/>
-      <w:r>
-        <w:rPr>
-          <w:lang w:val="fr-BE"/>
-        </w:rPr>
-        <w:t>: Numéro de téléphone de la boutique.</w:t>
+        <w:t>telephone: Numéro de téléphone de la boutique.</w:t>
       </w:r>
     </w:p>
     <w:p>
@@ -1685,33 +1388,11 @@
           <w:lang w:val="fr-BE"/>
         </w:rPr>
       </w:pPr>
-      <w:proofErr w:type="spellStart"/>
       <w:r>
         <w:rPr>
           <w:lang w:val="fr-BE"/>
         </w:rPr>
-        <w:t>n,n</w:t>
-      </w:r>
-      <w:proofErr w:type="spellEnd"/>
-      <w:r>
-        <w:rPr>
-          <w:lang w:val="fr-BE"/>
-        </w:rPr>
-        <w:t xml:space="preserve"> avec Produit via </w:t>
-      </w:r>
-      <w:proofErr w:type="spellStart"/>
-      <w:r>
-        <w:rPr>
-          <w:lang w:val="fr-BE"/>
-        </w:rPr>
-        <w:t>r_Boutique_Produit</w:t>
-      </w:r>
-      <w:proofErr w:type="spellEnd"/>
-      <w:r>
-        <w:rPr>
-          <w:lang w:val="fr-BE"/>
-        </w:rPr>
-        <w:t>: Une boutique peut vendre plusieurs produits.</w:t>
+        <w:t>n,n avec Produit via r_Boutique_Produit: Une boutique peut vendre plusieurs produits.</w:t>
       </w:r>
     </w:p>
     <w:p>
@@ -1721,33 +1402,11 @@
           <w:lang w:val="fr-BE"/>
         </w:rPr>
       </w:pPr>
-      <w:proofErr w:type="spellStart"/>
       <w:r>
         <w:rPr>
           <w:lang w:val="fr-BE"/>
         </w:rPr>
-        <w:t>n,n</w:t>
-      </w:r>
-      <w:proofErr w:type="spellEnd"/>
-      <w:r>
-        <w:rPr>
-          <w:lang w:val="fr-BE"/>
-        </w:rPr>
-        <w:t xml:space="preserve"> avec Promotion via </w:t>
-      </w:r>
-      <w:proofErr w:type="spellStart"/>
-      <w:r>
-        <w:rPr>
-          <w:lang w:val="fr-BE"/>
-        </w:rPr>
-        <w:t>r_Boutique_Promotion</w:t>
-      </w:r>
-      <w:proofErr w:type="spellEnd"/>
-      <w:r>
-        <w:rPr>
-          <w:lang w:val="fr-BE"/>
-        </w:rPr>
-        <w:t>: Une boutique peut appliquer plusieurs promotions à ses produits.</w:t>
+        <w:t>n,n avec Promotion via r_Boutique_Promotion: Une boutique peut appliquer plusieurs promotions à ses produits.</w:t>
       </w:r>
     </w:p>
     <w:p>
@@ -1855,19 +1514,11 @@
           <w:lang w:val="fr-BE"/>
         </w:rPr>
       </w:pPr>
-      <w:proofErr w:type="spellStart"/>
       <w:r>
         <w:rPr>
           <w:lang w:val="fr-BE"/>
         </w:rPr>
-        <w:t>total_montant</w:t>
-      </w:r>
-      <w:proofErr w:type="spellEnd"/>
-      <w:r>
-        <w:rPr>
-          <w:lang w:val="fr-BE"/>
-        </w:rPr>
-        <w:t>: Montant total de la commande.</w:t>
+        <w:t>total_montant: Montant total de la commande.</w:t>
       </w:r>
     </w:p>
     <w:p>
@@ -1877,19 +1528,11 @@
           <w:lang w:val="fr-BE"/>
         </w:rPr>
       </w:pPr>
-      <w:proofErr w:type="spellStart"/>
       <w:r>
         <w:rPr>
           <w:lang w:val="fr-BE"/>
         </w:rPr>
-        <w:t>date_commande</w:t>
-      </w:r>
-      <w:proofErr w:type="spellEnd"/>
-      <w:r>
-        <w:rPr>
-          <w:lang w:val="fr-BE"/>
-        </w:rPr>
-        <w:t>: Date à laquelle la commande a été passée.</w:t>
+        <w:t>date_commande: Date à laquelle la commande a été passée.</w:t>
       </w:r>
     </w:p>
     <w:p>
@@ -1899,19 +1542,11 @@
           <w:lang w:val="fr-BE"/>
         </w:rPr>
       </w:pPr>
-      <w:proofErr w:type="spellStart"/>
       <w:r>
         <w:rPr>
           <w:lang w:val="fr-BE"/>
         </w:rPr>
-        <w:t>adresse_livraison</w:t>
-      </w:r>
-      <w:proofErr w:type="spellEnd"/>
-      <w:r>
-        <w:rPr>
-          <w:lang w:val="fr-BE"/>
-        </w:rPr>
-        <w:t>: Adresse où la commande doit être livrée.</w:t>
+        <w:t>adresse_livraison: Adresse où la commande doit être livrée.</w:t>
       </w:r>
     </w:p>
     <w:p>
@@ -1925,49 +1560,7 @@
         <w:rPr>
           <w:lang w:val="fr-BE"/>
         </w:rPr>
-        <w:t>statut: Statut de la commande (</w:t>
-      </w:r>
-      <w:proofErr w:type="spellStart"/>
-      <w:r>
-        <w:rPr>
-          <w:lang w:val="fr-BE"/>
-        </w:rPr>
-        <w:t>en_attente</w:t>
-      </w:r>
-      <w:proofErr w:type="spellEnd"/>
-      <w:r>
-        <w:rPr>
-          <w:lang w:val="fr-BE"/>
-        </w:rPr>
-        <w:t xml:space="preserve">, </w:t>
-      </w:r>
-      <w:proofErr w:type="spellStart"/>
-      <w:r>
-        <w:rPr>
-          <w:lang w:val="fr-BE"/>
-        </w:rPr>
-        <w:t>confirmee</w:t>
-      </w:r>
-      <w:proofErr w:type="spellEnd"/>
-      <w:r>
-        <w:rPr>
-          <w:lang w:val="fr-BE"/>
-        </w:rPr>
-        <w:t xml:space="preserve">, </w:t>
-      </w:r>
-      <w:proofErr w:type="spellStart"/>
-      <w:r>
-        <w:rPr>
-          <w:lang w:val="fr-BE"/>
-        </w:rPr>
-        <w:t>expediee</w:t>
-      </w:r>
-      <w:proofErr w:type="spellEnd"/>
-      <w:r>
-        <w:rPr>
-          <w:lang w:val="fr-BE"/>
-        </w:rPr>
-        <w:t>, etc.).</w:t>
+        <w:t>statut: Statut de la commande (en_attente, confirmee, expediee, etc.).</w:t>
       </w:r>
     </w:p>
     <w:p>
@@ -2003,21 +1596,7 @@
         <w:rPr>
           <w:lang w:val="fr-BE"/>
         </w:rPr>
-        <w:t xml:space="preserve">1,n avec Utilisateur via </w:t>
-      </w:r>
-      <w:proofErr w:type="spellStart"/>
-      <w:r>
-        <w:rPr>
-          <w:lang w:val="fr-BE"/>
-        </w:rPr>
-        <w:t>r_Commande_Utilisateur</w:t>
-      </w:r>
-      <w:proofErr w:type="spellEnd"/>
-      <w:r>
-        <w:rPr>
-          <w:lang w:val="fr-BE"/>
-        </w:rPr>
-        <w:t>: Une commande est passée par un seul utilisateur.</w:t>
+        <w:t>1,n avec Utilisateur via r_Commande_Utilisateur: Une commande est passée par un seul utilisateur.</w:t>
       </w:r>
     </w:p>
     <w:p>
@@ -2027,33 +1606,11 @@
           <w:lang w:val="fr-BE"/>
         </w:rPr>
       </w:pPr>
-      <w:proofErr w:type="spellStart"/>
       <w:r>
         <w:rPr>
           <w:lang w:val="fr-BE"/>
         </w:rPr>
-        <w:t>n,n</w:t>
-      </w:r>
-      <w:proofErr w:type="spellEnd"/>
-      <w:r>
-        <w:rPr>
-          <w:lang w:val="fr-BE"/>
-        </w:rPr>
-        <w:t xml:space="preserve"> avec Produit via </w:t>
-      </w:r>
-      <w:proofErr w:type="spellStart"/>
-      <w:r>
-        <w:rPr>
-          <w:lang w:val="fr-BE"/>
-        </w:rPr>
-        <w:t>r_Commande_Produit</w:t>
-      </w:r>
-      <w:proofErr w:type="spellEnd"/>
-      <w:r>
-        <w:rPr>
-          <w:lang w:val="fr-BE"/>
-        </w:rPr>
-        <w:t>: Une commande peut inclure plusieurs produits.</w:t>
+        <w:t>n,n avec Produit via r_Commande_Produit: Une commande peut inclure plusieurs produits.</w:t>
       </w:r>
     </w:p>
     <w:p>
@@ -2185,19 +1742,11 @@
           <w:lang w:val="fr-BE"/>
         </w:rPr>
       </w:pPr>
-      <w:proofErr w:type="spellStart"/>
       <w:r>
         <w:rPr>
           <w:lang w:val="fr-BE"/>
         </w:rPr>
-        <w:t>methode_paiement</w:t>
-      </w:r>
-      <w:proofErr w:type="spellEnd"/>
-      <w:r>
-        <w:rPr>
-          <w:lang w:val="fr-BE"/>
-        </w:rPr>
-        <w:t>: Méthode utilisée pour le paiement (carte de crédit, PayPal, etc.).</w:t>
+        <w:t>methode_paiement: Méthode utilisée pour le paiement (carte de crédit, PayPal, etc.).</w:t>
       </w:r>
     </w:p>
     <w:p>
@@ -2207,47 +1756,11 @@
           <w:lang w:val="fr-BE"/>
         </w:rPr>
       </w:pPr>
-      <w:proofErr w:type="spellStart"/>
       <w:r>
         <w:rPr>
           <w:lang w:val="fr-BE"/>
         </w:rPr>
-        <w:t>statut_paiement</w:t>
-      </w:r>
-      <w:proofErr w:type="spellEnd"/>
-      <w:r>
-        <w:rPr>
-          <w:lang w:val="fr-BE"/>
-        </w:rPr>
-        <w:t xml:space="preserve">: Statut du paiement (paye, </w:t>
-      </w:r>
-      <w:proofErr w:type="spellStart"/>
-      <w:r>
-        <w:rPr>
-          <w:lang w:val="fr-BE"/>
-        </w:rPr>
-        <w:t>impaye</w:t>
-      </w:r>
-      <w:proofErr w:type="spellEnd"/>
-      <w:r>
-        <w:rPr>
-          <w:lang w:val="fr-BE"/>
-        </w:rPr>
-        <w:t xml:space="preserve">, </w:t>
-      </w:r>
-      <w:proofErr w:type="spellStart"/>
-      <w:r>
-        <w:rPr>
-          <w:lang w:val="fr-BE"/>
-        </w:rPr>
-        <w:t>echoue</w:t>
-      </w:r>
-      <w:proofErr w:type="spellEnd"/>
-      <w:r>
-        <w:rPr>
-          <w:lang w:val="fr-BE"/>
-        </w:rPr>
-        <w:t>).</w:t>
+        <w:t>statut_paiement: Statut du paiement (paye, impaye, echoue).</w:t>
       </w:r>
     </w:p>
     <w:p>
@@ -2257,19 +1770,11 @@
           <w:lang w:val="fr-BE"/>
         </w:rPr>
       </w:pPr>
-      <w:proofErr w:type="spellStart"/>
       <w:r>
         <w:rPr>
           <w:lang w:val="fr-BE"/>
         </w:rPr>
-        <w:t>date_paiement</w:t>
-      </w:r>
-      <w:proofErr w:type="spellEnd"/>
-      <w:r>
-        <w:rPr>
-          <w:lang w:val="fr-BE"/>
-        </w:rPr>
-        <w:t>: Date à laquelle le paiement a été effectué.</w:t>
+        <w:t>date_paiement: Date à laquelle le paiement a été effectué.</w:t>
       </w:r>
     </w:p>
     <w:p>
@@ -2279,19 +1784,11 @@
           <w:lang w:val="fr-BE"/>
         </w:rPr>
       </w:pPr>
-      <w:proofErr w:type="spellStart"/>
       <w:r>
         <w:rPr>
           <w:lang w:val="fr-BE"/>
         </w:rPr>
-        <w:t>transaction_id</w:t>
-      </w:r>
-      <w:proofErr w:type="spellEnd"/>
-      <w:r>
-        <w:rPr>
-          <w:lang w:val="fr-BE"/>
-        </w:rPr>
-        <w:t>: Identifiant de la transaction.</w:t>
+        <w:t>transaction_id: Identifiant de la transaction.</w:t>
       </w:r>
     </w:p>
     <w:p>
@@ -2433,19 +1930,11 @@
           <w:lang w:val="fr-BE"/>
         </w:rPr>
       </w:pPr>
-      <w:proofErr w:type="spellStart"/>
       <w:r>
         <w:rPr>
           <w:lang w:val="fr-BE"/>
         </w:rPr>
-        <w:t>Panier_Produit</w:t>
-      </w:r>
-      <w:proofErr w:type="spellEnd"/>
-      <w:r>
-        <w:rPr>
-          <w:lang w:val="fr-BE"/>
-        </w:rPr>
-        <w:t>: Identifiant unique de l'avis.</w:t>
+        <w:t>Panier_Produit: Identifiant unique de l'avis.</w:t>
       </w:r>
     </w:p>
     <w:p>
@@ -2483,19 +1972,11 @@
           <w:lang w:val="fr-BE"/>
         </w:rPr>
       </w:pPr>
-      <w:proofErr w:type="spellStart"/>
       <w:r>
         <w:rPr>
           <w:lang w:val="fr-BE"/>
         </w:rPr>
-        <w:t>date_creation</w:t>
-      </w:r>
-      <w:proofErr w:type="spellEnd"/>
-      <w:r>
-        <w:rPr>
-          <w:lang w:val="fr-BE"/>
-        </w:rPr>
-        <w:t>: Date de création de l'avis.</w:t>
+        <w:t>date_creation: Date de création de l'avis.</w:t>
       </w:r>
     </w:p>
     <w:p>
@@ -2531,21 +2012,7 @@
         <w:rPr>
           <w:lang w:val="fr-BE"/>
         </w:rPr>
-        <w:t xml:space="preserve">1,n avec Utilisateur via </w:t>
-      </w:r>
-      <w:proofErr w:type="spellStart"/>
-      <w:r>
-        <w:rPr>
-          <w:lang w:val="fr-BE"/>
-        </w:rPr>
-        <w:t>r_Avis_Utilisateur</w:t>
-      </w:r>
-      <w:proofErr w:type="spellEnd"/>
-      <w:r>
-        <w:rPr>
-          <w:lang w:val="fr-BE"/>
-        </w:rPr>
-        <w:t>: Un utilisateur peut donner plusieurs avis.</w:t>
+        <w:t>1,n avec Utilisateur via r_Avis_Utilisateur: Un utilisateur peut donner plusieurs avis.</w:t>
       </w:r>
     </w:p>
     <w:p>
@@ -2559,21 +2026,7 @@
         <w:rPr>
           <w:lang w:val="fr-BE"/>
         </w:rPr>
-        <w:t xml:space="preserve">1,n avec Produit via </w:t>
-      </w:r>
-      <w:proofErr w:type="spellStart"/>
-      <w:r>
-        <w:rPr>
-          <w:lang w:val="fr-BE"/>
-        </w:rPr>
-        <w:t>r_Avis_Produit</w:t>
-      </w:r>
-      <w:proofErr w:type="spellEnd"/>
-      <w:r>
-        <w:rPr>
-          <w:lang w:val="fr-BE"/>
-        </w:rPr>
-        <w:t>: Un produit peut recevoir plusieurs avis.</w:t>
+        <w:t>1,n avec Produit via r_Avis_Produit: Un produit peut recevoir plusieurs avis.</w:t>
       </w:r>
     </w:p>
     <w:p>
@@ -2705,19 +2158,11 @@
           <w:lang w:val="fr-BE"/>
         </w:rPr>
       </w:pPr>
-      <w:proofErr w:type="spellStart"/>
       <w:r>
         <w:rPr>
           <w:lang w:val="fr-BE"/>
         </w:rPr>
-        <w:t>valeur_remise</w:t>
-      </w:r>
-      <w:proofErr w:type="spellEnd"/>
-      <w:r>
-        <w:rPr>
-          <w:lang w:val="fr-BE"/>
-        </w:rPr>
-        <w:t>: Montant ou pourcentage de réduction offert.</w:t>
+        <w:t>valeur_remise: Montant ou pourcentage de réduction offert.</w:t>
       </w:r>
     </w:p>
     <w:p>
@@ -2727,19 +2172,11 @@
           <w:lang w:val="fr-BE"/>
         </w:rPr>
       </w:pPr>
-      <w:proofErr w:type="spellStart"/>
       <w:r>
         <w:rPr>
           <w:lang w:val="fr-BE"/>
         </w:rPr>
-        <w:t>date_debut</w:t>
-      </w:r>
-      <w:proofErr w:type="spellEnd"/>
-      <w:r>
-        <w:rPr>
-          <w:lang w:val="fr-BE"/>
-        </w:rPr>
-        <w:t>: Date de début de la promotion.</w:t>
+        <w:t>date_debut: Date de début de la promotion.</w:t>
       </w:r>
     </w:p>
     <w:p>
@@ -2749,33 +2186,11 @@
           <w:lang w:val="fr-BE"/>
         </w:rPr>
       </w:pPr>
-      <w:proofErr w:type="spellStart"/>
       <w:r>
         <w:rPr>
           <w:lang w:val="fr-BE"/>
         </w:rPr>
-        <w:t>type_remise</w:t>
-      </w:r>
-      <w:proofErr w:type="spellEnd"/>
-      <w:r>
-        <w:rPr>
-          <w:lang w:val="fr-BE"/>
-        </w:rPr>
-        <w:t xml:space="preserve">: Type de remise (pourcentage ou </w:t>
-      </w:r>
-      <w:proofErr w:type="spellStart"/>
-      <w:r>
-        <w:rPr>
-          <w:lang w:val="fr-BE"/>
-        </w:rPr>
-        <w:t>montant_fixe</w:t>
-      </w:r>
-      <w:proofErr w:type="spellEnd"/>
-      <w:r>
-        <w:rPr>
-          <w:lang w:val="fr-BE"/>
-        </w:rPr>
-        <w:t>).</w:t>
+        <w:t>type_remise: Type de remise (pourcentage ou montant_fixe).</w:t>
       </w:r>
     </w:p>
     <w:p>
@@ -2785,19 +2200,11 @@
           <w:lang w:val="fr-BE"/>
         </w:rPr>
       </w:pPr>
-      <w:proofErr w:type="spellStart"/>
       <w:r>
         <w:rPr>
           <w:lang w:val="fr-BE"/>
         </w:rPr>
-        <w:t>date_fin</w:t>
-      </w:r>
-      <w:proofErr w:type="spellEnd"/>
-      <w:r>
-        <w:rPr>
-          <w:lang w:val="fr-BE"/>
-        </w:rPr>
-        <w:t>: Date de fin de la promotion.</w:t>
+        <w:t>date_fin: Date de fin de la promotion.</w:t>
       </w:r>
     </w:p>
     <w:p>
@@ -2807,19 +2214,11 @@
           <w:lang w:val="fr-BE"/>
         </w:rPr>
       </w:pPr>
-      <w:proofErr w:type="spellStart"/>
       <w:r>
         <w:rPr>
           <w:lang w:val="fr-BE"/>
         </w:rPr>
-        <w:t>cree_par</w:t>
-      </w:r>
-      <w:proofErr w:type="spellEnd"/>
-      <w:r>
-        <w:rPr>
-          <w:lang w:val="fr-BE"/>
-        </w:rPr>
-        <w:t>: Identifiant de l'utilisateur qui a créé la promotion.</w:t>
+        <w:t>cree_par: Identifiant de l'utilisateur qui a créé la promotion.</w:t>
       </w:r>
     </w:p>
     <w:p>
@@ -2855,21 +2254,7 @@
         <w:rPr>
           <w:lang w:val="fr-BE"/>
         </w:rPr>
-        <w:t xml:space="preserve">1,n avec Produit via </w:t>
-      </w:r>
-      <w:proofErr w:type="spellStart"/>
-      <w:r>
-        <w:rPr>
-          <w:lang w:val="fr-BE"/>
-        </w:rPr>
-        <w:t>r_Promotion_Produit</w:t>
-      </w:r>
-      <w:proofErr w:type="spellEnd"/>
-      <w:r>
-        <w:rPr>
-          <w:lang w:val="fr-BE"/>
-        </w:rPr>
-        <w:t>: Une promotion est appliquée à un ou plusieurs produits.</w:t>
+        <w:t>1,n avec Produit via r_Promotion_Produit: Une promotion est appliquée à un ou plusieurs produits.</w:t>
       </w:r>
     </w:p>
     <w:p>
@@ -2883,21 +2268,7 @@
         <w:rPr>
           <w:lang w:val="fr-BE"/>
         </w:rPr>
-        <w:t xml:space="preserve">1,n avec Boutique via </w:t>
-      </w:r>
-      <w:proofErr w:type="spellStart"/>
-      <w:r>
-        <w:rPr>
-          <w:lang w:val="fr-BE"/>
-        </w:rPr>
-        <w:t>r_Boutique_Promotion</w:t>
-      </w:r>
-      <w:proofErr w:type="spellEnd"/>
-      <w:r>
-        <w:rPr>
-          <w:lang w:val="fr-BE"/>
-        </w:rPr>
-        <w:t>: Une promotion peut être créée pour plusieurs boutiques.</w:t>
+        <w:t>1,n avec Boutique via r_Boutique_Promotion: Une promotion peut être créée pour plusieurs boutiques.</w:t>
       </w:r>
     </w:p>
     <w:p>
@@ -2911,35 +2282,7 @@
         <w:rPr>
           <w:lang w:val="fr-BE"/>
         </w:rPr>
-        <w:t xml:space="preserve">1,n avec Utilisateur via </w:t>
-      </w:r>
-      <w:proofErr w:type="spellStart"/>
-      <w:r>
-        <w:rPr>
-          <w:lang w:val="fr-BE"/>
-        </w:rPr>
-        <w:t>r_Utilisateur_Promotion</w:t>
-      </w:r>
-      <w:proofErr w:type="spellEnd"/>
-      <w:r>
-        <w:rPr>
-          <w:lang w:val="fr-BE"/>
-        </w:rPr>
-        <w:t xml:space="preserve">: Un </w:t>
-      </w:r>
-      <w:proofErr w:type="spellStart"/>
-      <w:r>
-        <w:rPr>
-          <w:lang w:val="fr-BE"/>
-        </w:rPr>
-        <w:t>MarketingManager</w:t>
-      </w:r>
-      <w:proofErr w:type="spellEnd"/>
-      <w:r>
-        <w:rPr>
-          <w:lang w:val="fr-BE"/>
-        </w:rPr>
-        <w:t xml:space="preserve"> peut créer plusieurs promotions.</w:t>
+        <w:t>1,n avec Utilisateur via r_Utilisateur_Promotion: Un MarketingManager peut créer plusieurs promotions.</w:t>
       </w:r>
     </w:p>
     <w:p>
@@ -2961,21 +2304,7 @@
         <w:rPr>
           <w:lang w:val="fr-BE"/>
         </w:rPr>
-        <w:t>Tables Relationnelles (</w:t>
-      </w:r>
-      <w:proofErr w:type="spellStart"/>
-      <w:r>
-        <w:rPr>
-          <w:lang w:val="fr-BE"/>
-        </w:rPr>
-        <w:t>n,n</w:t>
-      </w:r>
-      <w:proofErr w:type="spellEnd"/>
-      <w:r>
-        <w:rPr>
-          <w:lang w:val="fr-BE"/>
-        </w:rPr>
-        <w:t>) :</w:t>
+        <w:t>Tables Relationnelles (n,n) :</w:t>
       </w:r>
     </w:p>
     <w:p>
@@ -2992,19 +2321,11 @@
           <w:lang w:val="fr-BE"/>
         </w:rPr>
       </w:pPr>
-      <w:proofErr w:type="spellStart"/>
       <w:r>
         <w:rPr>
           <w:lang w:val="fr-BE"/>
         </w:rPr>
-        <w:t>r_Panier_Produit</w:t>
-      </w:r>
-      <w:proofErr w:type="spellEnd"/>
-      <w:r>
-        <w:rPr>
-          <w:lang w:val="fr-BE"/>
-        </w:rPr>
-        <w:t xml:space="preserve"> :</w:t>
+        <w:t>r_Panier_Produit :</w:t>
       </w:r>
     </w:p>
     <w:p>
@@ -3078,20 +2399,12 @@
           <w:lang w:val="fr-BE"/>
         </w:rPr>
       </w:pPr>
-      <w:proofErr w:type="spellStart"/>
       <w:r>
         <w:rPr>
           <w:lang w:val="fr-BE"/>
         </w:rPr>
         <w:lastRenderedPageBreak/>
-        <w:t>r_Commande_Produit</w:t>
-      </w:r>
-      <w:proofErr w:type="spellEnd"/>
-      <w:r>
-        <w:rPr>
-          <w:lang w:val="fr-BE"/>
-        </w:rPr>
-        <w:t xml:space="preserve"> :</w:t>
+        <w:t>r_Commande_Produit :</w:t>
       </w:r>
     </w:p>
     <w:p>
@@ -3165,19 +2478,11 @@
           <w:lang w:val="fr-BE"/>
         </w:rPr>
       </w:pPr>
-      <w:proofErr w:type="spellStart"/>
       <w:r>
         <w:rPr>
           <w:lang w:val="fr-BE"/>
         </w:rPr>
-        <w:t>r_Promotion_Produit</w:t>
-      </w:r>
-      <w:proofErr w:type="spellEnd"/>
-      <w:r>
-        <w:rPr>
-          <w:lang w:val="fr-BE"/>
-        </w:rPr>
-        <w:t xml:space="preserve"> :</w:t>
+        <w:t>r_Promotion_Produit :</w:t>
       </w:r>
     </w:p>
     <w:p>
@@ -3251,19 +2556,11 @@
           <w:lang w:val="fr-BE"/>
         </w:rPr>
       </w:pPr>
-      <w:proofErr w:type="spellStart"/>
       <w:r>
         <w:rPr>
           <w:lang w:val="fr-BE"/>
         </w:rPr>
-        <w:t>r_Boutique_Produit</w:t>
-      </w:r>
-      <w:proofErr w:type="spellEnd"/>
-      <w:r>
-        <w:rPr>
-          <w:lang w:val="fr-BE"/>
-        </w:rPr>
-        <w:t xml:space="preserve"> :</w:t>
+        <w:t>r_Boutique_Produit :</w:t>
       </w:r>
     </w:p>
     <w:p>
@@ -3337,19 +2634,11 @@
           <w:lang w:val="fr-BE"/>
         </w:rPr>
       </w:pPr>
-      <w:proofErr w:type="spellStart"/>
       <w:r>
         <w:rPr>
           <w:lang w:val="fr-BE"/>
         </w:rPr>
-        <w:t>r_Boutique_Promotion</w:t>
-      </w:r>
-      <w:proofErr w:type="spellEnd"/>
-      <w:r>
-        <w:rPr>
-          <w:lang w:val="fr-BE"/>
-        </w:rPr>
-        <w:t xml:space="preserve"> :</w:t>
+        <w:t>r_Boutique_Promotion :</w:t>
       </w:r>
     </w:p>
     <w:p>
@@ -3423,19 +2712,11 @@
           <w:lang w:val="fr-BE"/>
         </w:rPr>
       </w:pPr>
-      <w:proofErr w:type="spellStart"/>
       <w:r>
         <w:rPr>
           <w:lang w:val="fr-BE"/>
         </w:rPr>
-        <w:t>r_Panier_Utilisateur</w:t>
-      </w:r>
-      <w:proofErr w:type="spellEnd"/>
-      <w:r>
-        <w:rPr>
-          <w:lang w:val="fr-BE"/>
-        </w:rPr>
-        <w:t xml:space="preserve"> :</w:t>
+        <w:t>r_Panier_Utilisateur :</w:t>
       </w:r>
     </w:p>
     <w:p>
@@ -3494,8 +2775,928 @@
         <w:t>Panier (0,n)</w:t>
       </w:r>
     </w:p>
+    <w:p>
+      <w:pPr>
+        <w:jc w:val="both"/>
+        <w:rPr>
+          <w:lang w:val="fr-BE"/>
+        </w:rPr>
+      </w:pPr>
+    </w:p>
+    <w:p>
+      <w:pPr>
+        <w:jc w:val="both"/>
+        <w:rPr>
+          <w:lang w:val="fr-BE"/>
+        </w:rPr>
+      </w:pPr>
+    </w:p>
+    <w:p>
+      <w:pPr>
+        <w:jc w:val="both"/>
+        <w:rPr>
+          <w:lang w:val="fr-BE"/>
+        </w:rPr>
+      </w:pPr>
+    </w:p>
+    <w:p>
+      <w:pPr>
+        <w:jc w:val="both"/>
+        <w:rPr>
+          <w:lang w:val="fr-BE"/>
+        </w:rPr>
+      </w:pPr>
+    </w:p>
+    <w:p>
+      <w:pPr>
+        <w:jc w:val="both"/>
+        <w:rPr>
+          <w:lang w:val="fr-BE"/>
+        </w:rPr>
+      </w:pPr>
+    </w:p>
+    <w:p>
+      <w:pPr>
+        <w:jc w:val="both"/>
+        <w:rPr>
+          <w:lang w:val="fr-BE"/>
+        </w:rPr>
+      </w:pPr>
+    </w:p>
+    <w:p>
+      <w:pPr>
+        <w:jc w:val="both"/>
+        <w:rPr>
+          <w:lang w:val="fr-BE"/>
+        </w:rPr>
+      </w:pPr>
+    </w:p>
+    <w:p>
+      <w:pPr>
+        <w:jc w:val="both"/>
+        <w:rPr>
+          <w:lang w:val="fr-BE"/>
+        </w:rPr>
+      </w:pPr>
+    </w:p>
+    <w:p>
+      <w:pPr>
+        <w:jc w:val="both"/>
+        <w:rPr>
+          <w:lang w:val="fr-BE"/>
+        </w:rPr>
+      </w:pPr>
+    </w:p>
+    <w:p>
+      <w:pPr>
+        <w:jc w:val="both"/>
+        <w:rPr>
+          <w:lang w:val="fr-BE"/>
+        </w:rPr>
+      </w:pPr>
+    </w:p>
+    <w:p>
+      <w:pPr>
+        <w:jc w:val="both"/>
+        <w:rPr>
+          <w:lang w:val="fr-BE"/>
+        </w:rPr>
+      </w:pPr>
+    </w:p>
+    <w:p>
+      <w:pPr>
+        <w:pStyle w:val="Titre1"/>
+        <w:rPr>
+          <w:lang w:val="fr-BE"/>
+        </w:rPr>
+      </w:pPr>
+      <w:r>
+        <w:rPr>
+          <w:lang w:val="fr-BE"/>
+        </w:rPr>
+        <w:lastRenderedPageBreak/>
+        <w:t>Diagramme de classe</w:t>
+      </w:r>
+    </w:p>
+    <w:p>
+      <w:pPr>
+        <w:rPr>
+          <w:lang w:val="fr-BE"/>
+        </w:rPr>
+      </w:pPr>
+    </w:p>
+    <w:p>
+      <w:pPr>
+        <w:pStyle w:val="Titre2"/>
+        <w:rPr>
+          <w:lang w:val="fr-BE"/>
+        </w:rPr>
+      </w:pPr>
+      <w:r>
+        <w:rPr>
+          <w:lang w:val="fr-BE"/>
+        </w:rPr>
+        <w:t>Diagramme de classe pour ShopConnectApplication</w:t>
+      </w:r>
+    </w:p>
+    <w:p>
+      <w:pPr>
+        <w:jc w:val="center"/>
+        <w:rPr>
+          <w:lang w:val="fr-BE"/>
+        </w:rPr>
+      </w:pPr>
+      <w:r>
+        <w:rPr>
+          <w:lang w:val="fr-BE"/>
+        </w:rPr>
+        <w:drawing>
+          <wp:inline distT="0" distB="0" distL="0" distR="0" wp14:anchorId="5FB4EB77" wp14:editId="2AB30E20">
+            <wp:extent cx="5630400" cy="3773750"/>
+            <wp:effectExtent l="0" t="0" r="8890" b="0"/>
+            <wp:docPr id="1536000669" name="Image 1"/>
+            <wp:cNvGraphicFramePr>
+              <a:graphicFrameLocks xmlns:a="http://schemas.openxmlformats.org/drawingml/2006/main" noChangeAspect="1"/>
+            </wp:cNvGraphicFramePr>
+            <a:graphic xmlns:a="http://schemas.openxmlformats.org/drawingml/2006/main">
+              <a:graphicData uri="http://schemas.openxmlformats.org/drawingml/2006/picture">
+                <pic:pic xmlns:pic="http://schemas.openxmlformats.org/drawingml/2006/picture">
+                  <pic:nvPicPr>
+                    <pic:cNvPr id="1536000669" name=""/>
+                    <pic:cNvPicPr/>
+                  </pic:nvPicPr>
+                  <pic:blipFill>
+                    <a:blip r:embed="rId14"/>
+                    <a:stretch>
+                      <a:fillRect/>
+                    </a:stretch>
+                  </pic:blipFill>
+                  <pic:spPr>
+                    <a:xfrm>
+                      <a:off x="0" y="0"/>
+                      <a:ext cx="5630400" cy="3773750"/>
+                    </a:xfrm>
+                    <a:prstGeom prst="rect">
+                      <a:avLst/>
+                    </a:prstGeom>
+                    <a:ln>
+                      <a:noFill/>
+                    </a:ln>
+                    <a:effectLst>
+                      <a:softEdge rad="112500"/>
+                    </a:effectLst>
+                  </pic:spPr>
+                </pic:pic>
+              </a:graphicData>
+            </a:graphic>
+          </wp:inline>
+        </w:drawing>
+      </w:r>
+    </w:p>
+    <w:p>
+      <w:pPr>
+        <w:rPr>
+          <w:lang w:val="fr-BE"/>
+        </w:rPr>
+      </w:pPr>
+    </w:p>
+    <w:p>
+      <w:pPr>
+        <w:rPr>
+          <w:lang w:val="fr-BE"/>
+        </w:rPr>
+      </w:pPr>
+    </w:p>
+    <w:p>
+      <w:pPr>
+        <w:pStyle w:val="Titre2"/>
+        <w:rPr>
+          <w:lang w:val="fr-BE"/>
+        </w:rPr>
+      </w:pPr>
+      <w:r>
+        <w:rPr>
+          <w:lang w:val="fr-BE"/>
+        </w:rPr>
+        <w:t>Diagramme de classe pour UtilisateurController et UtilisateurService</w:t>
+      </w:r>
+    </w:p>
+    <w:p>
+      <w:pPr>
+        <w:jc w:val="center"/>
+        <w:rPr>
+          <w:lang w:val="fr-BE"/>
+        </w:rPr>
+      </w:pPr>
+      <w:r>
+        <w:rPr>
+          <w:lang w:val="fr-BE"/>
+        </w:rPr>
+        <w:drawing>
+          <wp:inline distT="0" distB="0" distL="0" distR="0" wp14:anchorId="61A39482" wp14:editId="34EF0E1E">
+            <wp:extent cx="5630400" cy="3409657"/>
+            <wp:effectExtent l="0" t="0" r="8890" b="635"/>
+            <wp:docPr id="594901764" name="Image 1"/>
+            <wp:cNvGraphicFramePr>
+              <a:graphicFrameLocks xmlns:a="http://schemas.openxmlformats.org/drawingml/2006/main" noChangeAspect="1"/>
+            </wp:cNvGraphicFramePr>
+            <a:graphic xmlns:a="http://schemas.openxmlformats.org/drawingml/2006/main">
+              <a:graphicData uri="http://schemas.openxmlformats.org/drawingml/2006/picture">
+                <pic:pic xmlns:pic="http://schemas.openxmlformats.org/drawingml/2006/picture">
+                  <pic:nvPicPr>
+                    <pic:cNvPr id="594901764" name=""/>
+                    <pic:cNvPicPr/>
+                  </pic:nvPicPr>
+                  <pic:blipFill>
+                    <a:blip r:embed="rId15"/>
+                    <a:stretch>
+                      <a:fillRect/>
+                    </a:stretch>
+                  </pic:blipFill>
+                  <pic:spPr>
+                    <a:xfrm>
+                      <a:off x="0" y="0"/>
+                      <a:ext cx="5630400" cy="3409657"/>
+                    </a:xfrm>
+                    <a:prstGeom prst="rect">
+                      <a:avLst/>
+                    </a:prstGeom>
+                    <a:ln>
+                      <a:noFill/>
+                    </a:ln>
+                    <a:effectLst>
+                      <a:softEdge rad="112500"/>
+                    </a:effectLst>
+                  </pic:spPr>
+                </pic:pic>
+              </a:graphicData>
+            </a:graphic>
+          </wp:inline>
+        </w:drawing>
+      </w:r>
+    </w:p>
+    <w:p>
+      <w:pPr>
+        <w:jc w:val="center"/>
+        <w:rPr>
+          <w:lang w:val="fr-BE"/>
+        </w:rPr>
+      </w:pPr>
+    </w:p>
+    <w:p>
+      <w:pPr>
+        <w:pStyle w:val="Titre2"/>
+        <w:rPr>
+          <w:lang w:val="fr-BE"/>
+        </w:rPr>
+      </w:pPr>
+      <w:r>
+        <w:rPr>
+          <w:lang w:val="fr-BE"/>
+        </w:rPr>
+        <w:lastRenderedPageBreak/>
+        <w:t>Diagramme de classe pour AvisController et AvisService</w:t>
+      </w:r>
+    </w:p>
+    <w:p>
+      <w:pPr>
+        <w:jc w:val="center"/>
+        <w:rPr>
+          <w:lang w:val="fr-BE"/>
+        </w:rPr>
+      </w:pPr>
+      <w:r>
+        <w:rPr>
+          <w:lang w:val="fr-BE"/>
+        </w:rPr>
+        <w:drawing>
+          <wp:inline distT="0" distB="0" distL="0" distR="0" wp14:anchorId="44228FEA" wp14:editId="50E629BB">
+            <wp:extent cx="5630400" cy="4549493"/>
+            <wp:effectExtent l="0" t="0" r="8890" b="3810"/>
+            <wp:docPr id="2022232460" name="Image 1"/>
+            <wp:cNvGraphicFramePr>
+              <a:graphicFrameLocks xmlns:a="http://schemas.openxmlformats.org/drawingml/2006/main" noChangeAspect="1"/>
+            </wp:cNvGraphicFramePr>
+            <a:graphic xmlns:a="http://schemas.openxmlformats.org/drawingml/2006/main">
+              <a:graphicData uri="http://schemas.openxmlformats.org/drawingml/2006/picture">
+                <pic:pic xmlns:pic="http://schemas.openxmlformats.org/drawingml/2006/picture">
+                  <pic:nvPicPr>
+                    <pic:cNvPr id="2022232460" name=""/>
+                    <pic:cNvPicPr/>
+                  </pic:nvPicPr>
+                  <pic:blipFill>
+                    <a:blip r:embed="rId16"/>
+                    <a:stretch>
+                      <a:fillRect/>
+                    </a:stretch>
+                  </pic:blipFill>
+                  <pic:spPr>
+                    <a:xfrm>
+                      <a:off x="0" y="0"/>
+                      <a:ext cx="5630400" cy="4549493"/>
+                    </a:xfrm>
+                    <a:prstGeom prst="rect">
+                      <a:avLst/>
+                    </a:prstGeom>
+                    <a:ln>
+                      <a:noFill/>
+                    </a:ln>
+                    <a:effectLst>
+                      <a:softEdge rad="112500"/>
+                    </a:effectLst>
+                  </pic:spPr>
+                </pic:pic>
+              </a:graphicData>
+            </a:graphic>
+          </wp:inline>
+        </w:drawing>
+      </w:r>
+    </w:p>
+    <w:p>
+      <w:pPr>
+        <w:jc w:val="center"/>
+        <w:rPr>
+          <w:lang w:val="fr-BE"/>
+        </w:rPr>
+      </w:pPr>
+    </w:p>
+    <w:p>
+      <w:pPr>
+        <w:pStyle w:val="Titre2"/>
+        <w:rPr>
+          <w:lang w:val="fr-BE"/>
+        </w:rPr>
+      </w:pPr>
+      <w:r>
+        <w:rPr>
+          <w:lang w:val="fr-BE"/>
+        </w:rPr>
+        <w:t>Diagramme de classe pour BoutiqueController et BoutiqueService</w:t>
+      </w:r>
+    </w:p>
+    <w:p>
+      <w:pPr>
+        <w:jc w:val="center"/>
+        <w:rPr>
+          <w:lang w:val="fr-BE"/>
+        </w:rPr>
+      </w:pPr>
+      <w:r>
+        <w:rPr>
+          <w:lang w:val="fr-BE"/>
+        </w:rPr>
+        <w:drawing>
+          <wp:inline distT="0" distB="0" distL="0" distR="0" wp14:anchorId="7320EAA6" wp14:editId="36FE09B3">
+            <wp:extent cx="5631805" cy="3932471"/>
+            <wp:effectExtent l="0" t="0" r="7620" b="0"/>
+            <wp:docPr id="1218422683" name="Image 1"/>
+            <wp:cNvGraphicFramePr>
+              <a:graphicFrameLocks xmlns:a="http://schemas.openxmlformats.org/drawingml/2006/main" noChangeAspect="1"/>
+            </wp:cNvGraphicFramePr>
+            <a:graphic xmlns:a="http://schemas.openxmlformats.org/drawingml/2006/main">
+              <a:graphicData uri="http://schemas.openxmlformats.org/drawingml/2006/picture">
+                <pic:pic xmlns:pic="http://schemas.openxmlformats.org/drawingml/2006/picture">
+                  <pic:nvPicPr>
+                    <pic:cNvPr id="1218422683" name=""/>
+                    <pic:cNvPicPr/>
+                  </pic:nvPicPr>
+                  <pic:blipFill>
+                    <a:blip r:embed="rId17"/>
+                    <a:stretch>
+                      <a:fillRect/>
+                    </a:stretch>
+                  </pic:blipFill>
+                  <pic:spPr>
+                    <a:xfrm>
+                      <a:off x="0" y="0"/>
+                      <a:ext cx="5651063" cy="3945918"/>
+                    </a:xfrm>
+                    <a:prstGeom prst="rect">
+                      <a:avLst/>
+                    </a:prstGeom>
+                    <a:ln>
+                      <a:noFill/>
+                    </a:ln>
+                    <a:effectLst>
+                      <a:softEdge rad="112500"/>
+                    </a:effectLst>
+                  </pic:spPr>
+                </pic:pic>
+              </a:graphicData>
+            </a:graphic>
+          </wp:inline>
+        </w:drawing>
+      </w:r>
+    </w:p>
+    <w:p>
+      <w:pPr>
+        <w:pStyle w:val="Titre2"/>
+        <w:rPr>
+          <w:lang w:val="fr-BE"/>
+        </w:rPr>
+      </w:pPr>
+      <w:r>
+        <w:rPr>
+          <w:lang w:val="fr-BE"/>
+        </w:rPr>
+        <w:lastRenderedPageBreak/>
+        <w:t>Diagramme de classe pour ProduitController et ProduitService</w:t>
+      </w:r>
+    </w:p>
+    <w:p>
+      <w:pPr>
+        <w:jc w:val="center"/>
+        <w:rPr>
+          <w:lang w:val="fr-BE"/>
+        </w:rPr>
+      </w:pPr>
+      <w:r>
+        <w:rPr>
+          <w:lang w:val="fr-BE"/>
+        </w:rPr>
+        <w:drawing>
+          <wp:inline distT="0" distB="0" distL="0" distR="0" wp14:anchorId="64143DD3" wp14:editId="2F8517C2">
+            <wp:extent cx="5630400" cy="4141835"/>
+            <wp:effectExtent l="0" t="0" r="8890" b="0"/>
+            <wp:docPr id="1460463762" name="Image 1"/>
+            <wp:cNvGraphicFramePr>
+              <a:graphicFrameLocks xmlns:a="http://schemas.openxmlformats.org/drawingml/2006/main" noChangeAspect="1"/>
+            </wp:cNvGraphicFramePr>
+            <a:graphic xmlns:a="http://schemas.openxmlformats.org/drawingml/2006/main">
+              <a:graphicData uri="http://schemas.openxmlformats.org/drawingml/2006/picture">
+                <pic:pic xmlns:pic="http://schemas.openxmlformats.org/drawingml/2006/picture">
+                  <pic:nvPicPr>
+                    <pic:cNvPr id="1460463762" name=""/>
+                    <pic:cNvPicPr/>
+                  </pic:nvPicPr>
+                  <pic:blipFill>
+                    <a:blip r:embed="rId18"/>
+                    <a:stretch>
+                      <a:fillRect/>
+                    </a:stretch>
+                  </pic:blipFill>
+                  <pic:spPr>
+                    <a:xfrm>
+                      <a:off x="0" y="0"/>
+                      <a:ext cx="5630400" cy="4141835"/>
+                    </a:xfrm>
+                    <a:prstGeom prst="rect">
+                      <a:avLst/>
+                    </a:prstGeom>
+                    <a:ln>
+                      <a:noFill/>
+                    </a:ln>
+                    <a:effectLst>
+                      <a:softEdge rad="112500"/>
+                    </a:effectLst>
+                  </pic:spPr>
+                </pic:pic>
+              </a:graphicData>
+            </a:graphic>
+          </wp:inline>
+        </w:drawing>
+      </w:r>
+    </w:p>
+    <w:p>
+      <w:pPr>
+        <w:jc w:val="center"/>
+        <w:rPr>
+          <w:lang w:val="fr-BE"/>
+        </w:rPr>
+      </w:pPr>
+    </w:p>
+    <w:p>
+      <w:pPr>
+        <w:pStyle w:val="Titre2"/>
+        <w:rPr>
+          <w:lang w:val="fr-BE"/>
+        </w:rPr>
+      </w:pPr>
+      <w:r>
+        <w:rPr>
+          <w:lang w:val="fr-BE"/>
+        </w:rPr>
+        <w:t>Diagramme de classe pour PromotionController et PromotionService</w:t>
+      </w:r>
+    </w:p>
+    <w:p>
+      <w:pPr>
+        <w:jc w:val="center"/>
+        <w:rPr>
+          <w:lang w:val="fr-BE"/>
+        </w:rPr>
+      </w:pPr>
+      <w:r>
+        <w:rPr>
+          <w:lang w:val="fr-BE"/>
+        </w:rPr>
+        <w:drawing>
+          <wp:inline distT="0" distB="0" distL="0" distR="0" wp14:anchorId="6AB374FE" wp14:editId="579BC837">
+            <wp:extent cx="5630400" cy="3732978"/>
+            <wp:effectExtent l="0" t="0" r="8890" b="1270"/>
+            <wp:docPr id="1339504207" name="Image 1"/>
+            <wp:cNvGraphicFramePr>
+              <a:graphicFrameLocks xmlns:a="http://schemas.openxmlformats.org/drawingml/2006/main" noChangeAspect="1"/>
+            </wp:cNvGraphicFramePr>
+            <a:graphic xmlns:a="http://schemas.openxmlformats.org/drawingml/2006/main">
+              <a:graphicData uri="http://schemas.openxmlformats.org/drawingml/2006/picture">
+                <pic:pic xmlns:pic="http://schemas.openxmlformats.org/drawingml/2006/picture">
+                  <pic:nvPicPr>
+                    <pic:cNvPr id="1339504207" name=""/>
+                    <pic:cNvPicPr/>
+                  </pic:nvPicPr>
+                  <pic:blipFill>
+                    <a:blip r:embed="rId19"/>
+                    <a:stretch>
+                      <a:fillRect/>
+                    </a:stretch>
+                  </pic:blipFill>
+                  <pic:spPr>
+                    <a:xfrm>
+                      <a:off x="0" y="0"/>
+                      <a:ext cx="5630400" cy="3732978"/>
+                    </a:xfrm>
+                    <a:prstGeom prst="rect">
+                      <a:avLst/>
+                    </a:prstGeom>
+                    <a:ln>
+                      <a:noFill/>
+                    </a:ln>
+                    <a:effectLst>
+                      <a:softEdge rad="112500"/>
+                    </a:effectLst>
+                  </pic:spPr>
+                </pic:pic>
+              </a:graphicData>
+            </a:graphic>
+          </wp:inline>
+        </w:drawing>
+      </w:r>
+    </w:p>
+    <w:p>
+      <w:pPr>
+        <w:jc w:val="center"/>
+        <w:rPr>
+          <w:lang w:val="fr-BE"/>
+        </w:rPr>
+      </w:pPr>
+    </w:p>
+    <w:p>
+      <w:pPr>
+        <w:jc w:val="center"/>
+        <w:rPr>
+          <w:lang w:val="fr-BE"/>
+        </w:rPr>
+      </w:pPr>
+    </w:p>
+    <w:p>
+      <w:pPr>
+        <w:jc w:val="center"/>
+        <w:rPr>
+          <w:lang w:val="fr-BE"/>
+        </w:rPr>
+      </w:pPr>
+    </w:p>
+    <w:p>
+      <w:pPr>
+        <w:pStyle w:val="Titre2"/>
+        <w:rPr>
+          <w:lang w:val="fr-BE"/>
+        </w:rPr>
+      </w:pPr>
+      <w:r>
+        <w:rPr>
+          <w:lang w:val="fr-BE"/>
+        </w:rPr>
+        <w:lastRenderedPageBreak/>
+        <w:t>Diagramme de classe pour PaiementController et PaiementService</w:t>
+      </w:r>
+    </w:p>
+    <w:p>
+      <w:pPr>
+        <w:jc w:val="center"/>
+        <w:rPr>
+          <w:lang w:val="fr-BE"/>
+        </w:rPr>
+      </w:pPr>
+      <w:r>
+        <w:rPr>
+          <w:lang w:val="fr-BE"/>
+        </w:rPr>
+        <w:drawing>
+          <wp:inline distT="0" distB="0" distL="0" distR="0" wp14:anchorId="223DACDD" wp14:editId="7D473C8D">
+            <wp:extent cx="5630400" cy="3764180"/>
+            <wp:effectExtent l="0" t="0" r="8890" b="8255"/>
+            <wp:docPr id="1326035636" name="Image 1"/>
+            <wp:cNvGraphicFramePr>
+              <a:graphicFrameLocks xmlns:a="http://schemas.openxmlformats.org/drawingml/2006/main" noChangeAspect="1"/>
+            </wp:cNvGraphicFramePr>
+            <a:graphic xmlns:a="http://schemas.openxmlformats.org/drawingml/2006/main">
+              <a:graphicData uri="http://schemas.openxmlformats.org/drawingml/2006/picture">
+                <pic:pic xmlns:pic="http://schemas.openxmlformats.org/drawingml/2006/picture">
+                  <pic:nvPicPr>
+                    <pic:cNvPr id="1326035636" name=""/>
+                    <pic:cNvPicPr/>
+                  </pic:nvPicPr>
+                  <pic:blipFill>
+                    <a:blip r:embed="rId20"/>
+                    <a:stretch>
+                      <a:fillRect/>
+                    </a:stretch>
+                  </pic:blipFill>
+                  <pic:spPr>
+                    <a:xfrm>
+                      <a:off x="0" y="0"/>
+                      <a:ext cx="5630400" cy="3764180"/>
+                    </a:xfrm>
+                    <a:prstGeom prst="rect">
+                      <a:avLst/>
+                    </a:prstGeom>
+                    <a:ln>
+                      <a:noFill/>
+                    </a:ln>
+                    <a:effectLst>
+                      <a:softEdge rad="112500"/>
+                    </a:effectLst>
+                  </pic:spPr>
+                </pic:pic>
+              </a:graphicData>
+            </a:graphic>
+          </wp:inline>
+        </w:drawing>
+      </w:r>
+    </w:p>
+    <w:p>
+      <w:pPr>
+        <w:jc w:val="center"/>
+        <w:rPr>
+          <w:lang w:val="fr-BE"/>
+        </w:rPr>
+      </w:pPr>
+    </w:p>
+    <w:p>
+      <w:pPr>
+        <w:pStyle w:val="Titre2"/>
+        <w:rPr>
+          <w:lang w:val="fr-BE"/>
+        </w:rPr>
+      </w:pPr>
+      <w:r>
+        <w:rPr>
+          <w:lang w:val="fr-BE"/>
+        </w:rPr>
+        <w:t>Diagramme de classe pour CommandeController et CommandeService</w:t>
+      </w:r>
+    </w:p>
+    <w:p>
+      <w:pPr>
+        <w:jc w:val="center"/>
+        <w:rPr>
+          <w:lang w:val="fr-BE"/>
+        </w:rPr>
+      </w:pPr>
+      <w:r>
+        <w:rPr>
+          <w:lang w:val="fr-BE"/>
+        </w:rPr>
+        <w:drawing>
+          <wp:inline distT="0" distB="0" distL="0" distR="0" wp14:anchorId="715FBB7A" wp14:editId="7E798850">
+            <wp:extent cx="5630400" cy="3646365"/>
+            <wp:effectExtent l="0" t="0" r="8890" b="0"/>
+            <wp:docPr id="1112354825" name="Image 1"/>
+            <wp:cNvGraphicFramePr>
+              <a:graphicFrameLocks xmlns:a="http://schemas.openxmlformats.org/drawingml/2006/main" noChangeAspect="1"/>
+            </wp:cNvGraphicFramePr>
+            <a:graphic xmlns:a="http://schemas.openxmlformats.org/drawingml/2006/main">
+              <a:graphicData uri="http://schemas.openxmlformats.org/drawingml/2006/picture">
+                <pic:pic xmlns:pic="http://schemas.openxmlformats.org/drawingml/2006/picture">
+                  <pic:nvPicPr>
+                    <pic:cNvPr id="1112354825" name=""/>
+                    <pic:cNvPicPr/>
+                  </pic:nvPicPr>
+                  <pic:blipFill>
+                    <a:blip r:embed="rId21"/>
+                    <a:stretch>
+                      <a:fillRect/>
+                    </a:stretch>
+                  </pic:blipFill>
+                  <pic:spPr>
+                    <a:xfrm>
+                      <a:off x="0" y="0"/>
+                      <a:ext cx="5630400" cy="3646365"/>
+                    </a:xfrm>
+                    <a:prstGeom prst="rect">
+                      <a:avLst/>
+                    </a:prstGeom>
+                    <a:ln>
+                      <a:noFill/>
+                    </a:ln>
+                    <a:effectLst>
+                      <a:softEdge rad="112500"/>
+                    </a:effectLst>
+                  </pic:spPr>
+                </pic:pic>
+              </a:graphicData>
+            </a:graphic>
+          </wp:inline>
+        </w:drawing>
+      </w:r>
+    </w:p>
+    <w:p>
+      <w:pPr>
+        <w:jc w:val="center"/>
+        <w:rPr>
+          <w:lang w:val="fr-BE"/>
+        </w:rPr>
+      </w:pPr>
+    </w:p>
+    <w:p>
+      <w:pPr>
+        <w:jc w:val="center"/>
+        <w:rPr>
+          <w:lang w:val="fr-BE"/>
+        </w:rPr>
+      </w:pPr>
+    </w:p>
+    <w:p>
+      <w:pPr>
+        <w:jc w:val="center"/>
+        <w:rPr>
+          <w:lang w:val="fr-BE"/>
+        </w:rPr>
+      </w:pPr>
+    </w:p>
+    <w:p>
+      <w:pPr>
+        <w:jc w:val="center"/>
+        <w:rPr>
+          <w:lang w:val="fr-BE"/>
+        </w:rPr>
+      </w:pPr>
+    </w:p>
+    <w:p>
+      <w:pPr>
+        <w:jc w:val="center"/>
+        <w:rPr>
+          <w:lang w:val="fr-BE"/>
+        </w:rPr>
+      </w:pPr>
+    </w:p>
+    <w:p>
+      <w:pPr>
+        <w:pStyle w:val="Titre2"/>
+        <w:rPr>
+          <w:lang w:val="fr-BE"/>
+        </w:rPr>
+      </w:pPr>
+      <w:r>
+        <w:rPr>
+          <w:lang w:val="fr-BE"/>
+        </w:rPr>
+        <w:lastRenderedPageBreak/>
+        <w:t>Diagramme de classe pour CategorieController et CategorieService</w:t>
+      </w:r>
+    </w:p>
+    <w:p>
+      <w:pPr>
+        <w:jc w:val="center"/>
+        <w:rPr>
+          <w:lang w:val="fr-BE"/>
+        </w:rPr>
+      </w:pPr>
+      <w:r>
+        <w:rPr>
+          <w:lang w:val="fr-BE"/>
+        </w:rPr>
+        <w:drawing>
+          <wp:inline distT="0" distB="0" distL="0" distR="0" wp14:anchorId="5AC925ED" wp14:editId="62E64EB1">
+            <wp:extent cx="5630400" cy="3526397"/>
+            <wp:effectExtent l="0" t="0" r="8890" b="0"/>
+            <wp:docPr id="536644041" name="Image 1"/>
+            <wp:cNvGraphicFramePr>
+              <a:graphicFrameLocks xmlns:a="http://schemas.openxmlformats.org/drawingml/2006/main" noChangeAspect="1"/>
+            </wp:cNvGraphicFramePr>
+            <a:graphic xmlns:a="http://schemas.openxmlformats.org/drawingml/2006/main">
+              <a:graphicData uri="http://schemas.openxmlformats.org/drawingml/2006/picture">
+                <pic:pic xmlns:pic="http://schemas.openxmlformats.org/drawingml/2006/picture">
+                  <pic:nvPicPr>
+                    <pic:cNvPr id="536644041" name=""/>
+                    <pic:cNvPicPr/>
+                  </pic:nvPicPr>
+                  <pic:blipFill>
+                    <a:blip r:embed="rId22"/>
+                    <a:stretch>
+                      <a:fillRect/>
+                    </a:stretch>
+                  </pic:blipFill>
+                  <pic:spPr>
+                    <a:xfrm>
+                      <a:off x="0" y="0"/>
+                      <a:ext cx="5630400" cy="3526397"/>
+                    </a:xfrm>
+                    <a:prstGeom prst="rect">
+                      <a:avLst/>
+                    </a:prstGeom>
+                    <a:ln>
+                      <a:noFill/>
+                    </a:ln>
+                    <a:effectLst>
+                      <a:softEdge rad="112500"/>
+                    </a:effectLst>
+                  </pic:spPr>
+                </pic:pic>
+              </a:graphicData>
+            </a:graphic>
+          </wp:inline>
+        </w:drawing>
+      </w:r>
+    </w:p>
+    <w:p>
+      <w:pPr>
+        <w:jc w:val="center"/>
+        <w:rPr>
+          <w:lang w:val="fr-BE"/>
+        </w:rPr>
+      </w:pPr>
+    </w:p>
+    <w:p>
+      <w:pPr>
+        <w:jc w:val="center"/>
+        <w:rPr>
+          <w:lang w:val="fr-BE"/>
+        </w:rPr>
+      </w:pPr>
+    </w:p>
+    <w:p>
+      <w:pPr>
+        <w:pStyle w:val="Titre2"/>
+        <w:rPr>
+          <w:lang w:val="fr-BE"/>
+        </w:rPr>
+      </w:pPr>
+      <w:r>
+        <w:rPr>
+          <w:lang w:val="fr-BE"/>
+        </w:rPr>
+        <w:t>Diagramme de classe pour PanierController et PanierService</w:t>
+      </w:r>
+    </w:p>
+    <w:p>
+      <w:pPr>
+        <w:jc w:val="center"/>
+        <w:rPr>
+          <w:lang w:val="fr-BE"/>
+        </w:rPr>
+      </w:pPr>
+      <w:r>
+        <w:rPr>
+          <w:lang w:val="fr-BE"/>
+        </w:rPr>
+        <w:drawing>
+          <wp:inline distT="0" distB="0" distL="0" distR="0" wp14:anchorId="76A496B5" wp14:editId="67557E73">
+            <wp:extent cx="5630400" cy="3970223"/>
+            <wp:effectExtent l="0" t="0" r="8890" b="0"/>
+            <wp:docPr id="1137235900" name="Image 1"/>
+            <wp:cNvGraphicFramePr>
+              <a:graphicFrameLocks xmlns:a="http://schemas.openxmlformats.org/drawingml/2006/main" noChangeAspect="1"/>
+            </wp:cNvGraphicFramePr>
+            <a:graphic xmlns:a="http://schemas.openxmlformats.org/drawingml/2006/main">
+              <a:graphicData uri="http://schemas.openxmlformats.org/drawingml/2006/picture">
+                <pic:pic xmlns:pic="http://schemas.openxmlformats.org/drawingml/2006/picture">
+                  <pic:nvPicPr>
+                    <pic:cNvPr id="1137235900" name=""/>
+                    <pic:cNvPicPr/>
+                  </pic:nvPicPr>
+                  <pic:blipFill>
+                    <a:blip r:embed="rId23"/>
+                    <a:stretch>
+                      <a:fillRect/>
+                    </a:stretch>
+                  </pic:blipFill>
+                  <pic:spPr>
+                    <a:xfrm>
+                      <a:off x="0" y="0"/>
+                      <a:ext cx="5630400" cy="3970223"/>
+                    </a:xfrm>
+                    <a:prstGeom prst="rect">
+                      <a:avLst/>
+                    </a:prstGeom>
+                    <a:ln>
+                      <a:noFill/>
+                    </a:ln>
+                    <a:effectLst>
+                      <a:softEdge rad="112500"/>
+                    </a:effectLst>
+                  </pic:spPr>
+                </pic:pic>
+              </a:graphicData>
+            </a:graphic>
+          </wp:inline>
+        </w:drawing>
+      </w:r>
+    </w:p>
     <w:sectPr>
-      <w:footerReference w:type="default" r:id="rId13"/>
+      <w:footerReference w:type="default" r:id="rId24"/>
       <w:pgSz w:w="11906" w:h="16838" w:code="9"/>
       <w:pgMar w:top="720" w:right="720" w:bottom="720" w:left="720" w:header="720" w:footer="720" w:gutter="0"/>
       <w:cols w:space="720"/>
@@ -7068,7 +7269,6 @@
   <w:style w:type="character" w:default="1" w:styleId="Policepardfaut">
     <w:name w:val="Default Paragraph Font"/>
     <w:uiPriority w:val="1"/>
-    <w:semiHidden/>
     <w:unhideWhenUsed/>
   </w:style>
   <w:style w:type="table" w:default="1" w:styleId="TableauNormal">
@@ -31546,23 +31746,12 @@
 </file>
 
 <file path=customXml/item1.xml><?xml version="1.0" encoding="utf-8"?>
-<p:properties xmlns:p="http://schemas.microsoft.com/office/2006/metadata/properties" xmlns:xsi="http://www.w3.org/2001/XMLSchema-instance" xmlns:pc="http://schemas.microsoft.com/office/infopath/2007/PartnerControls">
-  <documentManagement>
-    <_ip_UnifiedCompliancePolicyUIAction xmlns="http://schemas.microsoft.com/sharepoint/v3" xsi:nil="true"/>
-    <Image xmlns="71af3243-3dd4-4a8d-8c0d-dd76da1f02a5">
-      <Url xsi:nil="true"/>
-      <Description xsi:nil="true"/>
-    </Image>
-    <Status xmlns="71af3243-3dd4-4a8d-8c0d-dd76da1f02a5">Not started</Status>
-    <Background xmlns="71af3243-3dd4-4a8d-8c0d-dd76da1f02a5">false</Background>
-    <_ip_UnifiedCompliancePolicyProperties xmlns="http://schemas.microsoft.com/sharepoint/v3" xsi:nil="true"/>
-    <ImageTagsTaxHTField xmlns="71af3243-3dd4-4a8d-8c0d-dd76da1f02a5">
-      <Terms xmlns="http://schemas.microsoft.com/office/infopath/2007/PartnerControls"/>
-    </ImageTagsTaxHTField>
-    <TaxCatchAll xmlns="230e9df3-be65-4c73-a93b-d1236ebd677e" xsi:nil="true"/>
-    <MediaServiceKeyPoints xmlns="71af3243-3dd4-4a8d-8c0d-dd76da1f02a5" xsi:nil="true"/>
-  </documentManagement>
-</p:properties>
+<?mso-contentType ?>
+<FormTemplates xmlns="http://schemas.microsoft.com/sharepoint/v3/contenttype/forms">
+  <Display>DocumentLibraryForm</Display>
+  <Edit>DocumentLibraryForm</Edit>
+  <New>DocumentLibraryForm</New>
+</FormTemplates>
 </file>
 
 <file path=customXml/item2.xml><?xml version="1.0" encoding="utf-8"?>
@@ -31854,22 +32043,33 @@
 </file>
 
 <file path=customXml/item3.xml><?xml version="1.0" encoding="utf-8"?>
-<?mso-contentType ?>
-<FormTemplates xmlns="http://schemas.microsoft.com/sharepoint/v3/contenttype/forms">
-  <Display>DocumentLibraryForm</Display>
-  <Edit>DocumentLibraryForm</Edit>
-  <New>DocumentLibraryForm</New>
-</FormTemplates>
+<p:properties xmlns:p="http://schemas.microsoft.com/office/2006/metadata/properties" xmlns:xsi="http://www.w3.org/2001/XMLSchema-instance" xmlns:pc="http://schemas.microsoft.com/office/infopath/2007/PartnerControls">
+  <documentManagement>
+    <_ip_UnifiedCompliancePolicyUIAction xmlns="http://schemas.microsoft.com/sharepoint/v3" xsi:nil="true"/>
+    <Image xmlns="71af3243-3dd4-4a8d-8c0d-dd76da1f02a5">
+      <Url xsi:nil="true"/>
+      <Description xsi:nil="true"/>
+    </Image>
+    <Status xmlns="71af3243-3dd4-4a8d-8c0d-dd76da1f02a5">Not started</Status>
+    <Background xmlns="71af3243-3dd4-4a8d-8c0d-dd76da1f02a5">false</Background>
+    <_ip_UnifiedCompliancePolicyProperties xmlns="http://schemas.microsoft.com/sharepoint/v3" xsi:nil="true"/>
+    <ImageTagsTaxHTField xmlns="71af3243-3dd4-4a8d-8c0d-dd76da1f02a5">
+      <Terms xmlns="http://schemas.microsoft.com/office/infopath/2007/PartnerControls"/>
+    </ImageTagsTaxHTField>
+    <TaxCatchAll xmlns="230e9df3-be65-4c73-a93b-d1236ebd677e" xsi:nil="true"/>
+    <MediaServiceKeyPoints xmlns="71af3243-3dd4-4a8d-8c0d-dd76da1f02a5" xsi:nil="true"/>
+  </documentManagement>
+</p:properties>
+</file>
+
+<file path=customXml/item4.xml><?xml version="1.0" encoding="utf-8"?>
+<b:Sources xmlns:b="http://schemas.openxmlformats.org/officeDocument/2006/bibliography" xmlns="http://schemas.openxmlformats.org/officeDocument/2006/bibliography" SelectedStyle="\APASixthEditionOfficeOnline.xsl" StyleName="APA" Version="6"/>
 </file>
 
 <file path=customXml/itemProps1.xml><?xml version="1.0" encoding="utf-8"?>
-<ds:datastoreItem xmlns:ds="http://schemas.openxmlformats.org/officeDocument/2006/customXml" ds:itemID="{EF4CB403-43D3-4084-BAD4-497D9897173A}">
+<ds:datastoreItem xmlns:ds="http://schemas.openxmlformats.org/officeDocument/2006/customXml" ds:itemID="{2F086410-FAE5-46E1-9CB0-7F0B44342972}">
   <ds:schemaRefs>
-    <ds:schemaRef ds:uri="http://schemas.microsoft.com/office/2006/metadata/properties"/>
-    <ds:schemaRef ds:uri="http://schemas.microsoft.com/office/infopath/2007/PartnerControls"/>
-    <ds:schemaRef ds:uri="http://schemas.microsoft.com/sharepoint/v3"/>
-    <ds:schemaRef ds:uri="71af3243-3dd4-4a8d-8c0d-dd76da1f02a5"/>
-    <ds:schemaRef ds:uri="230e9df3-be65-4c73-a93b-d1236ebd677e"/>
+    <ds:schemaRef ds:uri="http://schemas.microsoft.com/sharepoint/v3/contenttype/forms"/>
   </ds:schemaRefs>
 </ds:datastoreItem>
 </file>
@@ -31896,9 +32096,21 @@
 </file>
 
 <file path=customXml/itemProps3.xml><?xml version="1.0" encoding="utf-8"?>
-<ds:datastoreItem xmlns:ds="http://schemas.openxmlformats.org/officeDocument/2006/customXml" ds:itemID="{2F086410-FAE5-46E1-9CB0-7F0B44342972}">
+<ds:datastoreItem xmlns:ds="http://schemas.openxmlformats.org/officeDocument/2006/customXml" ds:itemID="{EF4CB403-43D3-4084-BAD4-497D9897173A}">
   <ds:schemaRefs>
-    <ds:schemaRef ds:uri="http://schemas.microsoft.com/sharepoint/v3/contenttype/forms"/>
+    <ds:schemaRef ds:uri="http://schemas.microsoft.com/office/2006/metadata/properties"/>
+    <ds:schemaRef ds:uri="http://schemas.microsoft.com/office/infopath/2007/PartnerControls"/>
+    <ds:schemaRef ds:uri="http://schemas.microsoft.com/sharepoint/v3"/>
+    <ds:schemaRef ds:uri="71af3243-3dd4-4a8d-8c0d-dd76da1f02a5"/>
+    <ds:schemaRef ds:uri="230e9df3-be65-4c73-a93b-d1236ebd677e"/>
+  </ds:schemaRefs>
+</ds:datastoreItem>
+</file>
+
+<file path=customXml/itemProps4.xml><?xml version="1.0" encoding="utf-8"?>
+<ds:datastoreItem xmlns:ds="http://schemas.openxmlformats.org/officeDocument/2006/customXml" ds:itemID="{14BCA67F-F6AE-4347-8630-1BC8C4C3C7B3}">
+  <ds:schemaRefs>
+    <ds:schemaRef ds:uri="http://schemas.openxmlformats.org/officeDocument/2006/bibliography"/>
   </ds:schemaRefs>
 </ds:datastoreItem>
 </file>
</xml_diff>